<commit_message>
Updated solution design and API specs
</commit_message>
<xml_diff>
--- a/PE-Sub-Platform-Solution-Design.docx
+++ b/PE-Sub-Platform-Solution-Design.docx
@@ -10901,7 +10901,7 @@
           <w:sz w:val="22"/>
           <w:szCs w:val="22"/>
         </w:rPr>
-        <w:t xml:space="preserve">Combined Score = (JW × 0.60) + ((1 – Lev_normalized) × 0.40) × 100</w:t>
+        <w:t xml:space="preserve">Combined Score = ((JW × 0.60) + ((1 – Lev_normalized) × 0.40)) × 100</w:t>
       </w:r>
     </w:p>
     <w:p>
@@ -11299,7 +11299,7 @@
           <w:sz w:val="22"/>
           <w:szCs w:val="22"/>
         </w:rPr>
-        <w:t xml:space="preserve">Normalization steps applied to both the agent name and each candidate, with before/after values</w:t>
+        <w:t xml:space="preserve">The normalised agent name (the step-by-step normalisation pipeline is reconstructed for display in the Match Analysis panel)</w:t>
       </w:r>
     </w:p>
     <w:p>

</xml_diff>

<commit_message>
Updated documentation and project configuration for better integration with BB templates.
</commit_message>
<xml_diff>
--- a/PE-Sub-Platform-Solution-Design.docx
+++ b/PE-Sub-Platform-Solution-Design.docx
@@ -338,7 +338,7 @@
           <w:sz w:val="22"/>
           <w:szCs w:val="22"/>
         </w:rPr>
-        <w:t xml:space="preserve">A subscription credit facility (sub line) is a revolving credit line extended to a private equity fund, secured by the unfunded capital commitments of the fund's Limited Partners (LPs). UBS participates as a lender in approximately 82 such facilities, each administered by an agent bank (Goldman Sachs, JPMorgan, Citibank, etc.).</w:t>
+        <w:t xml:space="preserve">A subscription credit facility (sub line) is a revolving credit line extended to a private equity fund, secured by the unfunded capital commitments of the fund's Limited Partners (LPs). UBS participates as a lender across approximately 71 facility positions administered by 17 agent banks (Wells Fargo, JPMorgan, Citibank, Bank of America, Morgan Stanley, etc.), representing roughly USD 10.6 billion of committed loan volume.</w:t>
       </w:r>
     </w:p>
     <w:p>
@@ -928,7 +928,7 @@
           <w:sz w:val="22"/>
           <w:szCs w:val="22"/>
         </w:rPr>
-        <w:t xml:space="preserve">Application tier: Spring Boot 3.4 microservices on AKS; API Gateway handles routing, JWT validation, and rate limiting</w:t>
+        <w:t xml:space="preserve">Application tier: Spring Boot 3.5 microservices on AKS; API Gateway handles routing, JWT validation, and rate limiting</w:t>
       </w:r>
     </w:p>
     <w:p>
@@ -1149,7 +1149,7 @@
                 <w:sz w:val="20"/>
                 <w:szCs w:val="20"/>
               </w:rPr>
-              <w:t xml:space="preserve">Spring Boot 3.4 · Apache POI</w:t>
+              <w:t xml:space="preserve">Spring Boot 3.5 · Apache POI</w:t>
             </w:r>
           </w:p>
         </w:tc>
@@ -1189,7 +1189,7 @@
                 <w:sz w:val="20"/>
                 <w:szCs w:val="20"/>
               </w:rPr>
-              <w:t xml:space="preserve">Spring Boot 3.4 · Apache Commons Text</w:t>
+              <w:t xml:space="preserve">Spring Boot 3.5 · Apache Commons Text</w:t>
             </w:r>
           </w:p>
         </w:tc>
@@ -1232,7 +1232,7 @@
                 <w:sz w:val="20"/>
                 <w:szCs w:val="20"/>
               </w:rPr>
-              <w:t xml:space="preserve">Spring Boot 3.4</w:t>
+              <w:t xml:space="preserve">Spring Boot 3.5</w:t>
             </w:r>
           </w:p>
         </w:tc>
@@ -1272,7 +1272,7 @@
                 <w:sz w:val="20"/>
                 <w:szCs w:val="20"/>
               </w:rPr>
-              <w:t xml:space="preserve">Spring Boot 3.4</w:t>
+              <w:t xml:space="preserve">Spring Boot 3.5</w:t>
             </w:r>
           </w:p>
         </w:tc>
@@ -1315,7 +1315,7 @@
                 <w:sz w:val="20"/>
                 <w:szCs w:val="20"/>
               </w:rPr>
-              <w:t xml:space="preserve">Spring Boot 3.4 · iText 8</w:t>
+              <w:t xml:space="preserve">Spring Boot 3.5 · iText 8</w:t>
             </w:r>
           </w:p>
         </w:tc>
@@ -1355,7 +1355,7 @@
                 <w:sz w:val="20"/>
                 <w:szCs w:val="20"/>
               </w:rPr>
-              <w:t xml:space="preserve">Spring Boot 3.4</w:t>
+              <w:t xml:space="preserve">Spring Boot 3.5</w:t>
             </w:r>
           </w:p>
         </w:tc>
@@ -12044,7 +12044,7 @@
         <w:spacing w:after="80" w:before="280"/>
       </w:pPr>
       <w:r>
-        <w:t xml:space="preserve">7.4 Portfolio Aggregates</w:t>
+        <w:t xml:space="preserve">7.3 Portfolio Aggregates</w:t>
       </w:r>
     </w:p>
     <w:tbl>
@@ -12289,7 +12289,7 @@
         <w:spacing w:after="80" w:before="280"/>
       </w:pPr>
       <w:r>
-        <w:t xml:space="preserve">7.5 Concentration Breach Rules</w:t>
+        <w:t xml:space="preserve">7.4 Concentration Breach Rules</w:t>
       </w:r>
     </w:p>
     <w:tbl>
@@ -16715,7 +16715,7 @@
                 <w:sz w:val="20"/>
                 <w:szCs w:val="20"/>
               </w:rPr>
-              <w:t xml:space="preserve">Current: ~21,847 across 82 facilities; growing ~10% annually</w:t>
+              <w:t xml:space="preserve">Current: ~21,847 across 71 facility positions; growing ~10% annually</w:t>
             </w:r>
           </w:p>
         </w:tc>
@@ -16752,7 +16752,7 @@
                 <w:sz w:val="20"/>
                 <w:szCs w:val="20"/>
               </w:rPr>
-              <w:t xml:space="preserve">Current: 82; headroom for new mandates</w:t>
+              <w:t xml:space="preserve">Current: 71 positions across 17 agent banks; headroom for new mandates</w:t>
             </w:r>
           </w:p>
         </w:tc>

</xml_diff>